<commit_message>
Add experiment charts to Word report
</commit_message>
<xml_diff>
--- a/并行KMeans聚类课程设计报告.docx
+++ b/并行KMeans聚类课程设计报告.docx
@@ -3169,6 +3169,60 @@
     </w:p>
     <w:p>
       <w:pPr>
+        <w:spacing w:before="120" w:after="60"/>
+        <w:jc w:val="center"/>
+      </w:pPr>
+      <w:r>
+        <w:drawing>
+          <wp:inline xmlns:a="http://schemas.openxmlformats.org/drawingml/2006/main" xmlns:pic="http://schemas.openxmlformats.org/drawingml/2006/picture">
+            <wp:extent cx="5029200" cy="3771900"/>
+            <wp:docPr id="1" name="Picture 1"/>
+            <wp:cNvGraphicFramePr>
+              <a:graphicFrameLocks noChangeAspect="1"/>
+            </wp:cNvGraphicFramePr>
+            <a:graphic>
+              <a:graphicData uri="http://schemas.openxmlformats.org/drawingml/2006/picture">
+                <pic:pic>
+                  <pic:nvPicPr>
+                    <pic:cNvPr id="0" name="speedup.png"/>
+                    <pic:cNvPicPr/>
+                  </pic:nvPicPr>
+                  <pic:blipFill>
+                    <a:blip r:embed="rId9"/>
+                    <a:stretch>
+                      <a:fillRect/>
+                    </a:stretch>
+                  </pic:blipFill>
+                  <pic:spPr>
+                    <a:xfrm>
+                      <a:off x="0" y="0"/>
+                      <a:ext cx="5029200" cy="3771900"/>
+                    </a:xfrm>
+                    <a:prstGeom prst="rect"/>
+                  </pic:spPr>
+                </pic:pic>
+              </a:graphicData>
+            </a:graphic>
+          </wp:inline>
+        </w:drawing>
+      </w:r>
+    </w:p>
+    <w:p>
+      <w:pPr>
+        <w:spacing w:after="240"/>
+        <w:jc w:val="center"/>
+      </w:pPr>
+      <w:r>
+        <w:rPr>
+          <w:rFonts w:ascii="Times New Roman" w:hAnsi="Times New Roman" w:eastAsia="宋体"/>
+          <w:i/>
+          <w:sz w:val="20"/>
+        </w:rPr>
+        <w:t>图 1  不同规模下的加速比曲线</w:t>
+      </w:r>
+    </w:p>
+    <w:p>
+      <w:pPr>
         <w:spacing w:line="360" w:lineRule="auto" w:after="120"/>
         <w:ind w:firstLine="576"/>
       </w:pPr>
@@ -3250,6 +3304,60 @@
           <w:sz w:val="28"/>
         </w:rPr>
         <w:t>6.3 效率分析</w:t>
+      </w:r>
+    </w:p>
+    <w:p>
+      <w:pPr>
+        <w:spacing w:before="120" w:after="60"/>
+        <w:jc w:val="center"/>
+      </w:pPr>
+      <w:r>
+        <w:drawing>
+          <wp:inline xmlns:a="http://schemas.openxmlformats.org/drawingml/2006/main" xmlns:pic="http://schemas.openxmlformats.org/drawingml/2006/picture">
+            <wp:extent cx="5029200" cy="3771900"/>
+            <wp:docPr id="2" name="Picture 2"/>
+            <wp:cNvGraphicFramePr>
+              <a:graphicFrameLocks noChangeAspect="1"/>
+            </wp:cNvGraphicFramePr>
+            <a:graphic>
+              <a:graphicData uri="http://schemas.openxmlformats.org/drawingml/2006/picture">
+                <pic:pic>
+                  <pic:nvPicPr>
+                    <pic:cNvPr id="0" name="efficiency.png"/>
+                    <pic:cNvPicPr/>
+                  </pic:nvPicPr>
+                  <pic:blipFill>
+                    <a:blip r:embed="rId10"/>
+                    <a:stretch>
+                      <a:fillRect/>
+                    </a:stretch>
+                  </pic:blipFill>
+                  <pic:spPr>
+                    <a:xfrm>
+                      <a:off x="0" y="0"/>
+                      <a:ext cx="5029200" cy="3771900"/>
+                    </a:xfrm>
+                    <a:prstGeom prst="rect"/>
+                  </pic:spPr>
+                </pic:pic>
+              </a:graphicData>
+            </a:graphic>
+          </wp:inline>
+        </w:drawing>
+      </w:r>
+    </w:p>
+    <w:p>
+      <w:pPr>
+        <w:spacing w:after="240"/>
+        <w:jc w:val="center"/>
+      </w:pPr>
+      <w:r>
+        <w:rPr>
+          <w:rFonts w:ascii="Times New Roman" w:hAnsi="Times New Roman" w:eastAsia="宋体"/>
+          <w:i/>
+          <w:sz w:val="20"/>
+        </w:rPr>
+        <w:t>图 2  不同规模下的效率曲线</w:t>
       </w:r>
     </w:p>
     <w:p>
@@ -3350,6 +3458,60 @@
           <w:sz w:val="28"/>
         </w:rPr>
         <w:t>6.5 成本分析</w:t>
+      </w:r>
+    </w:p>
+    <w:p>
+      <w:pPr>
+        <w:spacing w:before="120" w:after="60"/>
+        <w:jc w:val="center"/>
+      </w:pPr>
+      <w:r>
+        <w:drawing>
+          <wp:inline xmlns:a="http://schemas.openxmlformats.org/drawingml/2006/main" xmlns:pic="http://schemas.openxmlformats.org/drawingml/2006/picture">
+            <wp:extent cx="5029200" cy="3771900"/>
+            <wp:docPr id="3" name="Picture 3"/>
+            <wp:cNvGraphicFramePr>
+              <a:graphicFrameLocks noChangeAspect="1"/>
+            </wp:cNvGraphicFramePr>
+            <a:graphic>
+              <a:graphicData uri="http://schemas.openxmlformats.org/drawingml/2006/picture">
+                <pic:pic>
+                  <pic:nvPicPr>
+                    <pic:cNvPr id="0" name="cost.png"/>
+                    <pic:cNvPicPr/>
+                  </pic:nvPicPr>
+                  <pic:blipFill>
+                    <a:blip r:embed="rId11"/>
+                    <a:stretch>
+                      <a:fillRect/>
+                    </a:stretch>
+                  </pic:blipFill>
+                  <pic:spPr>
+                    <a:xfrm>
+                      <a:off x="0" y="0"/>
+                      <a:ext cx="5029200" cy="3771900"/>
+                    </a:xfrm>
+                    <a:prstGeom prst="rect"/>
+                  </pic:spPr>
+                </pic:pic>
+              </a:graphicData>
+            </a:graphic>
+          </wp:inline>
+        </w:drawing>
+      </w:r>
+    </w:p>
+    <w:p>
+      <w:pPr>
+        <w:spacing w:after="240"/>
+        <w:jc w:val="center"/>
+      </w:pPr>
+      <w:r>
+        <w:rPr>
+          <w:rFonts w:ascii="Times New Roman" w:hAnsi="Times New Roman" w:eastAsia="宋体"/>
+          <w:i/>
+          <w:sz w:val="20"/>
+        </w:rPr>
+        <w:t>图 4  不同规模下的成本曲线</w:t>
       </w:r>
     </w:p>
     <w:p>

</xml_diff>